<commit_message>
Updates to Andrew's bio
</commit_message>
<xml_diff>
--- a/authors/andrew-wells-bio.docx
+++ b/authors/andrew-wells-bio.docx
@@ -8,15 +8,29 @@
         <w:jc w:val="both"/>
         <w:rPr>
           <w:rFonts w:ascii="Calibri" w:hAnsi="Calibri" w:cs="Calibri"/>
-        </w:rPr>
-      </w:pPr>
-      <w:r>
-        <w:rPr>
-          <w:rFonts w:ascii="Calibri" w:hAnsi="Calibri" w:cs="Calibri"/>
           <w:b/>
           <w:bCs/>
         </w:rPr>
-        <w:t>Andrew Wells</w:t>
+      </w:pPr>
+      <w:r>
+        <w:rPr>
+          <w:rFonts w:ascii="Calibri" w:hAnsi="Calibri" w:cs="Calibri"/>
+        </w:rPr>
+        <w:t xml:space="preserve">Andrew Wells is an engineer and economist </w:t>
+      </w:r>
+      <w:proofErr w:type="spellStart"/>
+      <w:r>
+        <w:rPr>
+          <w:rFonts w:ascii="Calibri" w:hAnsi="Calibri" w:cs="Calibri"/>
+        </w:rPr>
+        <w:t>specialising</w:t>
+      </w:r>
+      <w:proofErr w:type="spellEnd"/>
+      <w:r>
+        <w:rPr>
+          <w:rFonts w:ascii="Calibri" w:hAnsi="Calibri" w:cs="Calibri"/>
+        </w:rPr>
+        <w:t xml:space="preserve"> in the intersection of electricity markets, investment, and climate policy — a niche he insists is more exciting than it sounds. He focused on how market design and credible investment incentives can support a rapid, efficient transition to clean energy.  He is also a renewable energy enthusiast who occasionally trades power market analysis for time on a surfboard.</w:t>
       </w:r>
     </w:p>
     <w:p>
@@ -25,53 +39,29 @@
         <w:jc w:val="both"/>
         <w:rPr>
           <w:rFonts w:ascii="Calibri" w:hAnsi="Calibri" w:cs="Calibri"/>
-          <w:b/>
-          <w:bCs/>
+          <w:i/>
+          <w:iCs/>
         </w:rPr>
       </w:pPr>
       <w:r>
         <w:rPr>
           <w:rFonts w:ascii="Calibri" w:hAnsi="Calibri" w:cs="Calibri"/>
         </w:rPr>
-        <w:t>Andrew Wells is</w:t>
-      </w:r>
-      <w:r>
-        <w:rPr>
-          <w:rFonts w:ascii="Calibri" w:hAnsi="Calibri" w:cs="Calibri"/>
-        </w:rPr>
-        <w:t xml:space="preserve"> an engineer and economist </w:t>
+        <w:t xml:space="preserve">Andrew holds a Bachelor of Engineering in Operations Research (First Class </w:t>
       </w:r>
       <w:proofErr w:type="spellStart"/>
       <w:r>
         <w:rPr>
           <w:rFonts w:ascii="Calibri" w:hAnsi="Calibri" w:cs="Calibri"/>
         </w:rPr>
-        <w:t>specialising</w:t>
+        <w:t>Honours</w:t>
       </w:r>
       <w:proofErr w:type="spellEnd"/>
       <w:r>
         <w:rPr>
           <w:rFonts w:ascii="Calibri" w:hAnsi="Calibri" w:cs="Calibri"/>
         </w:rPr>
-        <w:t xml:space="preserve"> in the intersection of electricity markets, investment, and climate policy — a niche </w:t>
-      </w:r>
-      <w:r>
-        <w:rPr>
-          <w:rFonts w:ascii="Calibri" w:hAnsi="Calibri" w:cs="Calibri"/>
-        </w:rPr>
-        <w:t>he insists</w:t>
-      </w:r>
-      <w:r>
-        <w:rPr>
-          <w:rFonts w:ascii="Calibri" w:hAnsi="Calibri" w:cs="Calibri"/>
-        </w:rPr>
-        <w:t xml:space="preserve"> is more exciting than it sounds. </w:t>
-      </w:r>
-      <w:r>
-        <w:rPr>
-          <w:rFonts w:ascii="Calibri" w:hAnsi="Calibri" w:cs="Calibri"/>
-        </w:rPr>
-        <w:t>He focused on how market design and credible investment incentives can support a rapid, efficient transition to clean energy.  He is also a renewable energy enthusiast who occasionally trades power market analysis for time on a surfboard.</w:t>
+        <w:t>), University of Auckland and a Master’s in the Economics of Energy, Climate Change and Sustainability from the Barcelona School of Economics. His research examined how cross-border electricity interconnectors can improve welfare and accelerate renewable integration in Great Britain.</w:t>
       </w:r>
     </w:p>
     <w:p>
@@ -80,107 +70,13 @@
         <w:jc w:val="both"/>
         <w:rPr>
           <w:rFonts w:ascii="Calibri" w:hAnsi="Calibri" w:cs="Calibri"/>
-          <w:i/>
-          <w:iCs/>
         </w:rPr>
       </w:pPr>
       <w:r>
         <w:rPr>
           <w:rFonts w:ascii="Calibri" w:hAnsi="Calibri" w:cs="Calibri"/>
         </w:rPr>
-        <w:t xml:space="preserve">Andrew </w:t>
-      </w:r>
-      <w:r>
-        <w:rPr>
-          <w:rFonts w:ascii="Calibri" w:hAnsi="Calibri" w:cs="Calibri"/>
-        </w:rPr>
-        <w:t>hold</w:t>
-      </w:r>
-      <w:r>
-        <w:rPr>
-          <w:rFonts w:ascii="Calibri" w:hAnsi="Calibri" w:cs="Calibri"/>
-        </w:rPr>
-        <w:t>s</w:t>
-      </w:r>
-      <w:r>
-        <w:rPr>
-          <w:rFonts w:ascii="Calibri" w:hAnsi="Calibri" w:cs="Calibri"/>
-        </w:rPr>
-        <w:t xml:space="preserve"> a Bachelor of Engineering</w:t>
-      </w:r>
-      <w:r>
-        <w:rPr>
-          <w:rFonts w:ascii="Calibri" w:hAnsi="Calibri" w:cs="Calibri"/>
-        </w:rPr>
-        <w:t xml:space="preserve"> in Operations Research</w:t>
-      </w:r>
-      <w:r>
-        <w:rPr>
-          <w:rFonts w:ascii="Calibri" w:hAnsi="Calibri" w:cs="Calibri"/>
-        </w:rPr>
-        <w:t xml:space="preserve"> (First Class </w:t>
-      </w:r>
-      <w:proofErr w:type="spellStart"/>
-      <w:r>
-        <w:rPr>
-          <w:rFonts w:ascii="Calibri" w:hAnsi="Calibri" w:cs="Calibri"/>
-        </w:rPr>
-        <w:t>Honours</w:t>
-      </w:r>
-      <w:proofErr w:type="spellEnd"/>
-      <w:r>
-        <w:rPr>
-          <w:rFonts w:ascii="Calibri" w:hAnsi="Calibri" w:cs="Calibri"/>
-        </w:rPr>
-        <w:t>)</w:t>
-      </w:r>
-      <w:r>
-        <w:rPr>
-          <w:rFonts w:ascii="Calibri" w:hAnsi="Calibri" w:cs="Calibri"/>
-        </w:rPr>
-        <w:t>,</w:t>
-      </w:r>
-      <w:r>
-        <w:rPr>
-          <w:rFonts w:ascii="Calibri" w:hAnsi="Calibri" w:cs="Calibri"/>
-        </w:rPr>
-        <w:t xml:space="preserve"> University of Auckland and a Master’s in the Economics of Energy, Climate Change and Sustainability from the Barcelona School of Economics. </w:t>
-      </w:r>
-      <w:r>
-        <w:rPr>
-          <w:rFonts w:ascii="Calibri" w:hAnsi="Calibri" w:cs="Calibri"/>
-        </w:rPr>
-        <w:t>His</w:t>
-      </w:r>
-      <w:r>
-        <w:rPr>
-          <w:rFonts w:ascii="Calibri" w:hAnsi="Calibri" w:cs="Calibri"/>
-        </w:rPr>
-        <w:t xml:space="preserve"> research </w:t>
-      </w:r>
-      <w:r>
-        <w:rPr>
-          <w:rFonts w:ascii="Calibri" w:hAnsi="Calibri" w:cs="Calibri"/>
-        </w:rPr>
-        <w:t>examined</w:t>
-      </w:r>
-      <w:r>
-        <w:rPr>
-          <w:rFonts w:ascii="Calibri" w:hAnsi="Calibri" w:cs="Calibri"/>
-        </w:rPr>
-        <w:t xml:space="preserve"> how cross-border </w:t>
-      </w:r>
-      <w:r>
-        <w:rPr>
-          <w:rFonts w:ascii="Calibri" w:hAnsi="Calibri" w:cs="Calibri"/>
-        </w:rPr>
-        <w:t xml:space="preserve">electricity </w:t>
-      </w:r>
-      <w:r>
-        <w:rPr>
-          <w:rFonts w:ascii="Calibri" w:hAnsi="Calibri" w:cs="Calibri"/>
-        </w:rPr>
-        <w:t>interconnectors can improve welfare and accelerate renewable integration in Great Britain.</w:t>
+        <w:t>Before returning to academia, Andrew worked at Drax, helping design the commercial structure for a £2 billion bioenergy with carbon capture and storage (BECCS) project — which mostly involved convincing very serious people that burning wood and burying the smoke was, in fact, a good idea. He also advised on sustainability strategy at Ampersand Partners and contributed to New Zealand’s national infrastructure strategy at the Infrastructure Commission.</w:t>
       </w:r>
     </w:p>
     <w:p>
@@ -195,81 +91,6 @@
         <w:rPr>
           <w:rFonts w:ascii="Calibri" w:hAnsi="Calibri" w:cs="Calibri"/>
         </w:rPr>
-        <w:t xml:space="preserve">Before returning to academia, </w:t>
-      </w:r>
-      <w:r>
-        <w:rPr>
-          <w:rFonts w:ascii="Calibri" w:hAnsi="Calibri" w:cs="Calibri"/>
-        </w:rPr>
-        <w:t>Andrew</w:t>
-      </w:r>
-      <w:r>
-        <w:rPr>
-          <w:rFonts w:ascii="Calibri" w:hAnsi="Calibri" w:cs="Calibri"/>
-        </w:rPr>
-        <w:t xml:space="preserve"> worked at Drax, helping design the commercial structure for a £2 billion bioenergy with carbon capture and storage (BECCS) </w:t>
-      </w:r>
-      <w:r>
-        <w:rPr>
-          <w:rFonts w:ascii="Calibri" w:hAnsi="Calibri" w:cs="Calibri"/>
-        </w:rPr>
-        <w:t xml:space="preserve">project </w:t>
-      </w:r>
-      <w:r>
-        <w:rPr>
-          <w:rFonts w:ascii="Calibri" w:hAnsi="Calibri" w:cs="Calibri"/>
-        </w:rPr>
-        <w:t>— which mostly involved convincing very serious people that burning wood and burying the smoke was</w:t>
-      </w:r>
-      <w:r>
-        <w:rPr>
-          <w:rFonts w:ascii="Calibri" w:hAnsi="Calibri" w:cs="Calibri"/>
-        </w:rPr>
-        <w:t>, in fact,</w:t>
-      </w:r>
-      <w:r>
-        <w:rPr>
-          <w:rFonts w:ascii="Calibri" w:hAnsi="Calibri" w:cs="Calibri"/>
-        </w:rPr>
-        <w:t xml:space="preserve"> a good idea. </w:t>
-      </w:r>
-      <w:r>
-        <w:rPr>
-          <w:rFonts w:ascii="Calibri" w:hAnsi="Calibri" w:cs="Calibri"/>
-        </w:rPr>
-        <w:t>He</w:t>
-      </w:r>
-      <w:r>
-        <w:rPr>
-          <w:rFonts w:ascii="Calibri" w:hAnsi="Calibri" w:cs="Calibri"/>
-        </w:rPr>
-        <w:t xml:space="preserve"> also advised on sustainability strategy at Ampersand Partners and </w:t>
-      </w:r>
-      <w:r>
-        <w:rPr>
-          <w:rFonts w:ascii="Calibri" w:hAnsi="Calibri" w:cs="Calibri"/>
-        </w:rPr>
-        <w:t>contributed to</w:t>
-      </w:r>
-      <w:r>
-        <w:rPr>
-          <w:rFonts w:ascii="Calibri" w:hAnsi="Calibri" w:cs="Calibri"/>
-        </w:rPr>
-        <w:t xml:space="preserve"> New Zealand’s national infrastructure strategy at the Infrastructure Commission.</w:t>
-      </w:r>
-    </w:p>
-    <w:p>
-      <w:pPr>
-        <w:spacing w:before="240" w:after="240"/>
-        <w:jc w:val="both"/>
-        <w:rPr>
-          <w:rFonts w:ascii="Calibri" w:hAnsi="Calibri" w:cs="Calibri"/>
-        </w:rPr>
-      </w:pPr>
-      <w:r>
-        <w:rPr>
-          <w:rFonts w:ascii="Calibri" w:hAnsi="Calibri" w:cs="Calibri"/>
-        </w:rPr>
         <w:t xml:space="preserve">At </w:t>
       </w:r>
       <w:r>
@@ -284,43 +105,7 @@
         <w:rPr>
           <w:rFonts w:ascii="Calibri" w:hAnsi="Calibri" w:cs="Calibri"/>
         </w:rPr>
-        <w:t xml:space="preserve">, </w:t>
-      </w:r>
-      <w:r>
-        <w:rPr>
-          <w:rFonts w:ascii="Calibri" w:hAnsi="Calibri" w:cs="Calibri"/>
-        </w:rPr>
-        <w:t>Andrew</w:t>
-      </w:r>
-      <w:r>
-        <w:rPr>
-          <w:rFonts w:ascii="Calibri" w:hAnsi="Calibri" w:cs="Calibri"/>
-        </w:rPr>
-        <w:t xml:space="preserve"> write</w:t>
-      </w:r>
-      <w:r>
-        <w:rPr>
-          <w:rFonts w:ascii="Calibri" w:hAnsi="Calibri" w:cs="Calibri"/>
-        </w:rPr>
-        <w:t>s</w:t>
-      </w:r>
-      <w:r>
-        <w:rPr>
-          <w:rFonts w:ascii="Calibri" w:hAnsi="Calibri" w:cs="Calibri"/>
-        </w:rPr>
-        <w:t xml:space="preserve"> about the economics of the energy transition — </w:t>
-      </w:r>
-      <w:r>
-        <w:rPr>
-          <w:rFonts w:ascii="Calibri" w:hAnsi="Calibri" w:cs="Calibri"/>
-        </w:rPr>
-        <w:t>where</w:t>
-      </w:r>
-      <w:r>
-        <w:rPr>
-          <w:rFonts w:ascii="Calibri" w:hAnsi="Calibri" w:cs="Calibri"/>
-        </w:rPr>
-        <w:t xml:space="preserve"> markets, investment, and policy all collide in the messy business of </w:t>
+        <w:t xml:space="preserve">, Andrew writes about the economics of the energy transition — where markets, investment, and policy all collide in the messy business of </w:t>
       </w:r>
       <w:proofErr w:type="spellStart"/>
       <w:r>

</xml_diff>